<commit_message>
Completar Análisis y Diseño: casos de uso, diagramas UML/E-R, mockups y limpieza de citas
</commit_message>
<xml_diff>
--- a/Fase 2/Evidencias Proyecto/Evidencias de Documentación/Análisis y Diseño/Mockups e Interfaces - TTDH Automation.docx
+++ b/Fase 2/Evidencias Proyecto/Evidencias de Documentación/Análisis y Diseño/Mockups e Interfaces - TTDH Automation.docx
@@ -130,7 +130,7 @@
         <w:rPr>
           <w:rtl w:val="0"/>
         </w:rPr>
-        <w:t xml:space="preserve"> [cite: 7], asegurando que las pantallas cumplan con los requerimientos funcionales establecidos (RF01 al RF11) [cite: 4] y faciliten la interacción de los analistas operativos y administradores de Banco Genérico con los flujos de la Tesorería General de la República (TGR) [cite: 7].</w:t>
+        <w:t>, asegurando que las pantallas cumplan con los requerimientos funcionales establecidos (RF01 al RF11) y faciliten la interacción de los analistas operativos y administradores de Banco Genérico con los flujos de la Tesorería General de la República (TGR).</w:t>
       </w:r>
     </w:p>
     <w:p>
@@ -257,7 +257,7 @@
         <w:rPr>
           <w:rtl w:val="0"/>
         </w:rPr>
-        <w:t xml:space="preserve"> (Soporte RF01 y RF02) [cite: 4]</w:t>
+        <w:t xml:space="preserve"> (Soporte RF01 y RF02)</w:t>
       </w:r>
     </w:p>
     <w:p>
@@ -280,7 +280,7 @@
         <w:rPr>
           <w:rtl w:val="0"/>
         </w:rPr>
-        <w:t xml:space="preserve"> (Soporte RF06 y RF11) [cite: 4]</w:t>
+        <w:t xml:space="preserve"> (Soporte RF06 y RF11)</w:t>
       </w:r>
     </w:p>
     <w:p>
@@ -303,7 +303,7 @@
         <w:rPr>
           <w:rtl w:val="0"/>
         </w:rPr>
-        <w:t xml:space="preserve"> (Soporte RF04 y RF05) [cite: 4]</w:t>
+        <w:t xml:space="preserve"> (Soporte RF04 y RF05)</w:t>
       </w:r>
     </w:p>
     <w:p>
@@ -326,7 +326,7 @@
         <w:rPr>
           <w:rtl w:val="0"/>
         </w:rPr>
-        <w:t xml:space="preserve"> (Soporte RF08, RF09 y RF10) [cite: 4]</w:t>
+        <w:t xml:space="preserve"> (Soporte RF08, RF09 y RF10)</w:t>
       </w:r>
     </w:p>
     <w:p>
@@ -385,6 +385,17 @@
     </w:p>
     <w:p>
       <w:pPr>
+        <w:rPr/>
+      </w:pPr>
+      <w:r>
+        <w:rPr>
+          <w:rtl w:val="0"/>
+        </w:rPr>
+        <w:t xml:space="preserve">Los mockups fueron elaborados como prototipos de fidelidad media en HTML/CSS, utilizando datos ficticios. Todas las vistas comparten una barra de navegación lateral con los módulos de la plataforma y un encabezado con el título de la pantalla.</w:t>
+      </w:r>
+    </w:p>
+    <w:p>
+      <w:pPr>
         <w:pStyle w:val="Heading3"/>
         <w:rPr/>
       </w:pPr>
@@ -424,7 +435,7 @@
         <w:rPr>
           <w:rtl w:val="0"/>
         </w:rPr>
-        <w:t xml:space="preserve"> Permitir al usuario subir los archivos masivos de deudores enviados por la TGR (CSV, XLSX, TXT) [cite: 4, 7].</w:t>
+        <w:t xml:space="preserve"> Permitir al usuario subir los archivos masivos de deudores enviados por la TGR (CSV, XLSX, TXT).</w:t>
       </w:r>
     </w:p>
     <w:p>
@@ -594,6 +605,58 @@
     </w:p>
     <w:p>
       <w:pPr>
+        <w:jc w:val="center"/>
+      </w:pPr>
+      <w:r>
+        <w:drawing>
+          <wp:inline>
+            <wp:extent cx="5715000" cy="2857500"/>
+            <wp:docPr id="1" name="Picture 1"/>
+            <wp:cNvGraphicFramePr>
+              <a:graphicFrameLocks noChangeAspect="1"/>
+            </wp:cNvGraphicFramePr>
+            <a:graphic>
+              <a:graphicData uri="http://schemas.openxmlformats.org/drawingml/2006/picture">
+                <pic:pic>
+                  <pic:nvPicPr>
+                    <pic:cNvPr id="0" name="v1_ingesta.png"/>
+                    <pic:cNvPicPr/>
+                  </pic:nvPicPr>
+                  <pic:blipFill>
+                    <a:blip r:embed="rId6"/>
+                    <a:stretch>
+                      <a:fillRect/>
+                    </a:stretch>
+                  </pic:blipFill>
+                  <pic:spPr>
+                    <a:xfrm>
+                      <a:off x="0" y="0"/>
+                      <a:ext cx="5715000" cy="2857500"/>
+                    </a:xfrm>
+                    <a:prstGeom prst="rect"/>
+                  </pic:spPr>
+                </pic:pic>
+              </a:graphicData>
+            </a:graphic>
+          </wp:inline>
+        </w:drawing>
+      </w:r>
+    </w:p>
+    <w:p>
+      <w:pPr>
+        <w:jc w:val="center"/>
+      </w:pPr>
+      <w:r>
+        <w:rPr>
+          <w:i/>
+          <w:color w:val="555F6B"/>
+          <w:sz w:val="18"/>
+        </w:rPr>
+        <w:t>Figura 1: Mockup de la pantalla de Ingesta y Carga de Archivos TGR.</w:t>
+      </w:r>
+    </w:p>
+    <w:p>
+      <w:pPr>
         <w:pStyle w:val="Heading3"/>
         <w:rPr/>
       </w:pPr>
@@ -633,7 +696,7 @@
         <w:rPr>
           <w:rtl w:val="0"/>
         </w:rPr>
-        <w:t xml:space="preserve"> Mostrar los indicadores clave de desempeño (KPIs) y el resumen general del proceso de conciliación [cite: 4, 7].</w:t>
+        <w:t xml:space="preserve"> Mostrar los indicadores clave de desempeño (KPIs) y el resumen general del proceso de conciliación.</w:t>
       </w:r>
     </w:p>
     <w:p>
@@ -879,6 +942,58 @@
     </w:p>
     <w:p>
       <w:pPr>
+        <w:jc w:val="center"/>
+      </w:pPr>
+      <w:r>
+        <w:drawing>
+          <wp:inline>
+            <wp:extent cx="5715000" cy="2341562"/>
+            <wp:docPr id="2" name="Picture 2"/>
+            <wp:cNvGraphicFramePr>
+              <a:graphicFrameLocks noChangeAspect="1"/>
+            </wp:cNvGraphicFramePr>
+            <a:graphic>
+              <a:graphicData uri="http://schemas.openxmlformats.org/drawingml/2006/picture">
+                <pic:pic>
+                  <pic:nvPicPr>
+                    <pic:cNvPr id="0" name="v2_dashboard.png"/>
+                    <pic:cNvPicPr/>
+                  </pic:nvPicPr>
+                  <pic:blipFill>
+                    <a:blip r:embed="rId7"/>
+                    <a:stretch>
+                      <a:fillRect/>
+                    </a:stretch>
+                  </pic:blipFill>
+                  <pic:spPr>
+                    <a:xfrm>
+                      <a:off x="0" y="0"/>
+                      <a:ext cx="5715000" cy="2341562"/>
+                    </a:xfrm>
+                    <a:prstGeom prst="rect"/>
+                  </pic:spPr>
+                </pic:pic>
+              </a:graphicData>
+            </a:graphic>
+          </wp:inline>
+        </w:drawing>
+      </w:r>
+    </w:p>
+    <w:p>
+      <w:pPr>
+        <w:jc w:val="center"/>
+      </w:pPr>
+      <w:r>
+        <w:rPr>
+          <w:i/>
+          <w:color w:val="555F6B"/>
+          <w:sz w:val="18"/>
+        </w:rPr>
+        <w:t>Figura 2: Mockup del Panel de Control y Monitoreo.</w:t>
+      </w:r>
+    </w:p>
+    <w:p>
+      <w:pPr>
         <w:pStyle w:val="Heading3"/>
         <w:rPr/>
       </w:pPr>
@@ -918,7 +1033,7 @@
         <w:rPr>
           <w:rtl w:val="0"/>
         </w:rPr>
-        <w:t xml:space="preserve"> Gestionar los registros que no pasaron las validaciones automáticas (RUT inválido, duplicados, campos incompletos) [cite: 4].</w:t>
+        <w:t xml:space="preserve"> Gestionar los registros que no pasaron las validaciones automáticas (RUT inválido, duplicados, campos incompletos).</w:t>
       </w:r>
     </w:p>
     <w:p>
@@ -1064,6 +1179,58 @@
     </w:p>
     <w:p>
       <w:pPr>
+        <w:jc w:val="center"/>
+      </w:pPr>
+      <w:r>
+        <w:drawing>
+          <wp:inline>
+            <wp:extent cx="5715000" cy="2698750"/>
+            <wp:docPr id="3" name="Picture 3"/>
+            <wp:cNvGraphicFramePr>
+              <a:graphicFrameLocks noChangeAspect="1"/>
+            </wp:cNvGraphicFramePr>
+            <a:graphic>
+              <a:graphicData uri="http://schemas.openxmlformats.org/drawingml/2006/picture">
+                <pic:pic>
+                  <pic:nvPicPr>
+                    <pic:cNvPr id="0" name="v3_excepciones.png"/>
+                    <pic:cNvPicPr/>
+                  </pic:nvPicPr>
+                  <pic:blipFill>
+                    <a:blip r:embed="rId8"/>
+                    <a:stretch>
+                      <a:fillRect/>
+                    </a:stretch>
+                  </pic:blipFill>
+                  <pic:spPr>
+                    <a:xfrm>
+                      <a:off x="0" y="0"/>
+                      <a:ext cx="5715000" cy="2698750"/>
+                    </a:xfrm>
+                    <a:prstGeom prst="rect"/>
+                  </pic:spPr>
+                </pic:pic>
+              </a:graphicData>
+            </a:graphic>
+          </wp:inline>
+        </w:drawing>
+      </w:r>
+    </w:p>
+    <w:p>
+      <w:pPr>
+        <w:jc w:val="center"/>
+      </w:pPr>
+      <w:r>
+        <w:rPr>
+          <w:i/>
+          <w:color w:val="555F6B"/>
+          <w:sz w:val="18"/>
+        </w:rPr>
+        <w:t>Figura 3: Mockup de la Bandeja de Excepciones y Reglas de Negocio.</w:t>
+      </w:r>
+    </w:p>
+    <w:p>
+      <w:pPr>
         <w:pStyle w:val="Heading3"/>
         <w:rPr/>
       </w:pPr>
@@ -1103,7 +1270,7 @@
         <w:rPr>
           <w:rtl w:val="0"/>
         </w:rPr>
-        <w:t xml:space="preserve"> Exponer los informes parametrizables y las sugerencias automatizadas generadas por el modelo de IA [cite: 4].</w:t>
+        <w:t xml:space="preserve"> Exponer los informes parametrizables y las sugerencias automatizadas generadas por el modelo de IA.</w:t>
       </w:r>
     </w:p>
     <w:p>
@@ -1243,6 +1410,58 @@
           <w:rtl w:val="0"/>
         </w:rPr>
         <w:t xml:space="preserve">Botón de "Aplicar Sugerencia de Validación".</w:t>
+      </w:r>
+    </w:p>
+    <w:p>
+      <w:pPr>
+        <w:jc w:val="center"/>
+      </w:pPr>
+      <w:r>
+        <w:drawing>
+          <wp:inline>
+            <wp:extent cx="5715000" cy="3077104"/>
+            <wp:docPr id="4" name="Picture 4"/>
+            <wp:cNvGraphicFramePr>
+              <a:graphicFrameLocks noChangeAspect="1"/>
+            </wp:cNvGraphicFramePr>
+            <a:graphic>
+              <a:graphicData uri="http://schemas.openxmlformats.org/drawingml/2006/picture">
+                <pic:pic>
+                  <pic:nvPicPr>
+                    <pic:cNvPr id="0" name="v4_reportes_ia.png"/>
+                    <pic:cNvPicPr/>
+                  </pic:nvPicPr>
+                  <pic:blipFill>
+                    <a:blip r:embed="rId9"/>
+                    <a:stretch>
+                      <a:fillRect/>
+                    </a:stretch>
+                  </pic:blipFill>
+                  <pic:spPr>
+                    <a:xfrm>
+                      <a:off x="0" y="0"/>
+                      <a:ext cx="5715000" cy="3077104"/>
+                    </a:xfrm>
+                    <a:prstGeom prst="rect"/>
+                  </pic:spPr>
+                </pic:pic>
+              </a:graphicData>
+            </a:graphic>
+          </wp:inline>
+        </w:drawing>
+      </w:r>
+    </w:p>
+    <w:p>
+      <w:pPr>
+        <w:jc w:val="center"/>
+      </w:pPr>
+      <w:r>
+        <w:rPr>
+          <w:i/>
+          <w:color w:val="555F6B"/>
+          <w:sz w:val="18"/>
+        </w:rPr>
+        <w:t>Figura 4: Mockup del Módulo de Reportes e Insights de IA.</w:t>
       </w:r>
     </w:p>
     <w:p>
@@ -1319,7 +1538,7 @@
         <w:rPr>
           <w:rtl w:val="0"/>
         </w:rPr>
-        <w:t xml:space="preserve"> David Muñoz Bravo (Desarrollo Backend / Interfaces) [cite: 7].</w:t>
+        <w:t xml:space="preserve"> David Muñoz Bravo (Desarrollo Backend / Interfaces).</w:t>
       </w:r>
     </w:p>
     <w:p>
@@ -1342,7 +1561,7 @@
         <w:rPr>
           <w:rtl w:val="0"/>
         </w:rPr>
-        <w:t xml:space="preserve"> María Trinidad Gaete Mella (Gestión y Requerimientos) y equipo completo de STARTAB [cite: 7].</w:t>
+        <w:t xml:space="preserve"> María Trinidad Gaete Mella (Gestión y Requerimientos) y equipo completo de STARTAB.</w:t>
       </w:r>
     </w:p>
     <w:sectPr>

</xml_diff>